<commit_message>
Working paper draft 2 (2026-10-04): docx and pdf rebuilt
</commit_message>
<xml_diff>
--- a/papers/claim-contract-working-paper.docx
+++ b/papers/claim-contract-working-paper.docx
@@ -43,7 +43,7 @@
         <w:pStyle w:val="BodyText"/>
       </w:pPr>
       <w:r>
-        <w:t xml:space="preserve">Working paper, draft 1, 2026-09-29. Companion to SSRN 7156938, 7309319, 7341481 and 7423798. Specification, checker, task file, run files and the misquote ledger are public under CC BY 4.0 at financeratecalc.com and github.com/financeratecalc.</w:t>
+        <w:t xml:space="preserve">Working paper, draft 2, 2026-10-04 (draft 1: 2026-09-29). Companion to SSRN 7156938, 7309319, 7341481 and 7423798. Specification, checker, task file, run files and the misquote ledger are public under CC BY 4.0 at financeratecalc.com and github.com/financeratecalc.</w:t>
       </w:r>
     </w:p>
     <w:p>
@@ -82,7 +82,7 @@
         <w:t xml:space="preserve">”</w:t>
       </w:r>
       <w:r>
-        <w:t xml:space="preserve">, which places it entirely on the model. This paper moves half of it back to the publisher. It specifies Claim Contract 1.0, a small machine-readable format in which a statistic ships with the conditions under which it may be restated; a reference implementation covering 189 claims from the 2025 federal HMDA record; a publisher-agnostic checker; and a runnable fidelity task (Inspect AI) that grades an answer twice, once for value and once for fidelity to the contract, under four conditions of source access. It then reports what a single publisher could and could not change from its side of the interface, measured on one model over 12 questions × 3 repeats per condition. A contract-shaped sentence in the tool output did not change value correctness (27/36 before and after) or full-credit answers (11/36 and 11/36); it changed the mix of failures, in a direction consistent with the model copying past the contracted edge rather than inventing, and none of the per-code differences reach significance at n = 36. A verification token (claim receipt) embedded in prose survived restatement in 0/36 and 1/36 answers; a client instructed to treat the receipt as part of the figure carried it in 14/36 at partial coverage and 23/36 at full coverage (Fisher p = 0.06 between the two, p &lt; 0.001 against prose). The same client forged receipt-shaped strings for figures without one, and continued to do so at full coverage (2/36): a convention that is half-declared is counterfeited, and a convention that is fully declared must still be verified. Three companion instruments are described: a Cliché Index (19 folk claims about FHA denial; models rarely believe the contradicted ones, and after a labelling correction assert the unknowable in at most 6/57 answers), a correction-latency record, and a public misquote ledger. Auditing the publisher’s own pages during the experiment found eleven error families since July, five in the most machine-readable page family; the model was faithful and the publisher was wrong, and the paper treats this as a bound on every fidelity figure it reports. All results pass through a single model-based grader; the second-provider grader planned for this series was not run. Nothing here is a finding about language models in general. It is a report on what one instrument measured, published so that a laboratory can administer the task without the publisher.</w:t>
+        <w:t xml:space="preserve">, which places it entirely on the model. This paper moves half of it back to the publisher. It specifies Claim Contract 1.0, a small machine-readable format in which a statistic ships with the conditions under which it may be restated; a reference implementation covering 189 claims from the 2025 federal HMDA record; a publisher-agnostic checker; and a runnable fidelity task (Inspect AI) that grades an answer twice, once for value and once for fidelity to the contract, under four conditions of source access. It then reports what a single publisher could and could not change from its side of the interface, measured on one model over 12 questions × 3 repeats per condition. A contract-shaped sentence in the tool output did not change value correctness (27/27 on the nine numeric questions before and after; the three textual questions could not be value-scored by the instrument, a fault found on 2026-09-29 and recorded in §8) or full-credit answers (11/36 and 11/36); it changed the mix of failures, in a direction consistent with the model copying past the contracted edge rather than inventing, and none of the per-code differences reach significance at n = 36. A verification token (claim receipt) embedded in prose survived restatement in 0/36 and 1/36 answers; a client instructed to treat the receipt as part of the figure carried it in 14/36 at partial coverage and 23/36 at full coverage (Fisher p = 0.06 between the two, p &lt; 0.001 against prose). The same client forged receipt-shaped strings for figures without one, and continued to do so at full coverage (2/36): a convention that is half-declared is counterfeited, and a convention that is fully declared must still be verified. Three companion instruments are described: a Cliché Index (19 folk claims about FHA denial; models rarely believe the contradicted ones, and after a labelling correction assert the unknowable in at most 6/57 answers), a correction-latency record, and a public misquote ledger. Auditing the publisher’s own pages during the experiment found eleven error families since July, five in the most machine-readable page family; the model was faithful and the publisher was wrong, and the paper treats this as a bound on every fidelity figure it reports. All results pass through a single model-based grader; the second-provider grader planned for this series was not run. Nothing here is a finding about language models in general. It is a report on what one instrument measured, published so that a laboratory can administer the task without the publisher.</w:t>
       </w:r>
     </w:p>
     <w:p>
@@ -833,6 +833,77 @@
       </w:r>
       <w:r>
         <w:t xml:space="preserve">.</w:t>
+      </w:r>
+    </w:p>
+    <w:p>
+      <w:pPr>
+        <w:pStyle w:val="BodyText"/>
+      </w:pPr>
+      <w:r>
+        <w:t xml:space="preserve">Three additions were made after the first administrations (spec drafts 9–10, 2026-10-01/02).</w:t>
+      </w:r>
+      <w:r>
+        <w:t xml:space="preserve"> </w:t>
+      </w:r>
+      <w:r>
+        <w:rPr>
+          <w:bCs/>
+          <w:b/>
+        </w:rPr>
+        <w:t xml:space="preserve">Issue channel:</w:t>
+      </w:r>
+      <w:r>
+        <w:t xml:space="preserve"> </w:t>
+      </w:r>
+      <w:r>
+        <w:t xml:space="preserve">a receipt may carry a fifth segment</w:t>
+      </w:r>
+      <w:r>
+        <w:t xml:space="preserve"> </w:t>
+      </w:r>
+      <w:r>
+        <w:rPr>
+          <w:rStyle w:val="VerbatimChar"/>
+        </w:rPr>
+        <w:t xml:space="preserve">:&lt;channel&gt;&lt;YYMM&gt;</w:t>
+      </w:r>
+      <w:r>
+        <w:t xml:space="preserve"> </w:t>
+      </w:r>
+      <w:r>
+        <w:t xml:space="preserve">naming the door it was issued through (MCP tool, site page, dataset, API, RL environment) and the month; the hash does not cover it and a verifier accepts both forms, so a figure found in the wild says where it came from and how old the copy is without a probe.</w:t>
+      </w:r>
+      <w:r>
+        <w:t xml:space="preserve"> </w:t>
+      </w:r>
+      <w:r>
+        <w:rPr>
+          <w:bCs/>
+          <w:b/>
+        </w:rPr>
+        <w:t xml:space="preserve">Claim transparency:</w:t>
+      </w:r>
+      <w:r>
+        <w:t xml:space="preserve"> </w:t>
+      </w:r>
+      <w:r>
+        <w:t xml:space="preserve">the publisher signs a snapshot of every issued (id, value, hash8) keylessly with Sigstore, identity being the build workflow, and the signature is entered in the public Rekor log; a receipt absent from every snapshot was never issued, one present in an earlier snapshot only was issued before a correction, and a consumer or an RL reward can verify without calling the publisher’s endpoint, trusting the Sigstore identity binding instead. The log prevents deletion of a published snapshot, not failure to publish a new one after a correction; that remains a process guarantee enforced by the rebuild workflow.</w:t>
+      </w:r>
+      <w:r>
+        <w:t xml:space="preserve"> </w:t>
+      </w:r>
+      <w:r>
+        <w:rPr>
+          <w:bCs/>
+          <w:b/>
+        </w:rPr>
+        <w:t xml:space="preserve">Build provenance:</w:t>
+      </w:r>
+      <w:r>
+        <w:t xml:space="preserve"> </w:t>
+      </w:r>
+      <w:r>
+        <w:t xml:space="preserve">the published figures are recomputed from the CFPB file inside an attested hosted build (SLSA v1 provenance as issued by GitHub’s attestation action; not certified at any level) and compared with the shipped files; on 2026-10-02 the national, 98 lender and 52 state figures reproduced exactly. This is computational reproduction with no human in the chain, not independent replication: L4 is unchanged.</w:t>
       </w:r>
     </w:p>
     <w:p>
@@ -1573,7 +1644,7 @@
         <w:t xml:space="preserve">?mode=raw</w:t>
       </w:r>
       <w:r>
-        <w:t xml:space="preserve">), the corrected grader, 12 × 3. Value correct 27/36; full marks 11/36; partial 14/36. FABRICATED_SUPPORT 12/36, ATTRIBUTION_DRIFT 10/36, OVERREACH_FROM_SOURCE 9/36, SCOPE_MISSING 6/36.</w:t>
+        <w:t xml:space="preserve">), the corrected grader, 12 × 3. Value correct 27/27 on the nine numeric questions†; full marks 11/36; partial 14/36. FABRICATED_SUPPORT 12/36, ATTRIBUTION_DRIFT 10/36, OVERREACH_FROM_SOURCE 9/36, SCOPE_MISSING 6/36.</w:t>
       </w:r>
     </w:p>
     <w:p>
@@ -1611,7 +1682,7 @@
         <w:t xml:space="preserve">quotable_sentence</w:t>
       </w:r>
       <w:r>
-        <w:t xml:space="preserve">: the canonical template rendered with value, denominator, universe and attribution. Against the comparable control: value 27/36 → 27/36; full marks 11/36 → 11/36; partial 14/36 → 14/36. The sentence does not change how often the model earns full credit. Two earlier readings of this comparison (10 → 11 across different graders; 5 → 11 from a misread run) were wrong and are retired.</w:t>
+        <w:t xml:space="preserve">: the canonical template rendered with value, denominator, universe and attribution. Against the comparable control: value 27/27† → 27/27†; full marks 11/36 → 11/36; partial 14/36 → 14/36. The sentence does not change how often the model earns full credit. Two earlier readings of this comparison (10 → 11 across different graders; 5 → 11 from a misread run) were wrong and are retired.</w:t>
       </w:r>
     </w:p>
     <w:p>
@@ -1722,7 +1793,7 @@
         <w:pStyle w:val="BodyText"/>
       </w:pPr>
       <w:r>
-        <w:t xml:space="preserve">Full marks in the full-coverage run collapsed to 1/36 while OVERREACH_FROM_SOURCE rose from 14/36 to 28/36, same model, grader and questions. The tool outputs are longer in 1.14.1 (receipt, receipt rule and quoting rule on every tool), and the grader marks any sentence beyond the returned fields as overreach. Value correctness (27/36) and consistency (8/12) did not move. This is recorded as the grader reading richer tool output, and as a limit of the single-grader design, not as a finding about receipts. It is the strongest reason the second-provider grader is needed before any of §5 is cited as more than one instrument’s reading.</w:t>
+        <w:t xml:space="preserve">Full marks in the full-coverage run collapsed to 1/36 while OVERREACH_FROM_SOURCE rose from 14/36 to 28/36, same model, grader and questions. The tool outputs are longer in 1.14.1 (receipt, receipt rule and quoting rule on every tool), and the grader marks any sentence beyond the returned fields as overreach. Value correctness (27/27†) and consistency (8/12) did not move. This is recorded as the grader reading richer tool output, and as a limit of the single-grader design, not as a finding about receipts. It is the strongest reason the second-provider grader is needed before any of §5 is cited as more than one instrument’s reading.</w:t>
       </w:r>
     </w:p>
     <w:bookmarkEnd w:id="40"/>
@@ -1740,7 +1811,7 @@
         <w:pStyle w:val="FirstParagraph"/>
       </w:pPr>
       <w:r>
-        <w:t xml:space="preserve">Value correctness is 27/36 in every run of the series: raw control, sentence, receipt at end, receipt on number, D partial, D full. Nothing the publisher did to the tool output changed which figure the model wrote; it changed what the model wrote around the figure.</w:t>
+        <w:t xml:space="preserve">Value correctness on the nine numeric questions is 27/27 in every run of the series: raw control, sentence, receipt at end, receipt on number, D partial, D full. The three textual questions (where to find the data, local versus national lenders, whether the publisher has corrected itself) were scored 0/3 in every run by a value scorer that demanded a DOI, dates and list counts token by token; that is an instrument fault, found while packaging the task on 2026-09-29, and their value is unmeasured before that date. Nothing the publisher did to the tool output changed which figure the model wrote; it changed what the model wrote around the figure.</w:t>
       </w:r>
     </w:p>
     <w:p>
@@ -1917,6 +1988,23 @@
         <w:t xml:space="preserve">The HECM universe correction (2026-07-26, 21.7% → 22.1%) was picked up by one web-connected system within a day of the site banner that announced it. The small-loan universe correction produced the instructive case: on 2026-09-22 one system served the old 3.2× because the publisher’s own stat page still carried it. That latency was the publisher’s, not the engine’s, and it is logged that way.</w:t>
       </w:r>
     </w:p>
+    <w:p>
+      <w:pPr>
+        <w:pStyle w:val="BodyText"/>
+      </w:pPr>
+      <w:r>
+        <w:t xml:space="preserve">Latency has one cause the publisher can remove: consuming systems have nowhere to listen. Since 2026-10-02 the corrections log is also published as a feed (</w:t>
+      </w:r>
+      <w:r>
+        <w:rPr>
+          <w:rStyle w:val="VerbatimChar"/>
+        </w:rPr>
+        <w:t xml:space="preserve">/corrections.json</w:t>
+      </w:r>
+      <w:r>
+        <w:t xml:space="preserve">: every entry, error family and correction atom, with claim ids and old/new values where stated, derived from the human log and never hand-edited; spec §7d). Whether any system polls it is the next measurement, and the latency series will say.</w:t>
+      </w:r>
+    </w:p>
     <w:bookmarkEnd w:id="44"/>
     <w:bookmarkStart w:id="45" w:name="the-misquote-ledger"/>
     <w:p>
@@ -2060,7 +2148,7 @@
         <w:t xml:space="preserve"> </w:t>
       </w:r>
       <w:r>
-        <w:t xml:space="preserve">Every figure in §5 passed through one model-based grader. The full-coverage run shows that the grader’s reading of longer tool output can move the full-marks figure from 11/36 to 1/36 with value and consistency unchanged. The second-provider grader was planned and not run (credit). Until it runs, §5 is one instrument’s reading.</w:t>
+        <w:t xml:space="preserve">Observed results are sensitive to evaluation configuration; the current study cannot separate model behaviour from grader and prompt-condition effects. Every figure in §5 passed through one model-based grader. The full-coverage run shows that the grader’s reading of longer tool output can move the full-marks figure from 11/36 to 1/36 with value and consistency unchanged. The second-provider grader was planned and not run (credit). Until it runs, §5 is one instrument’s reading.</w:t>
       </w:r>
     </w:p>
     <w:p>
@@ -2193,6 +2281,46 @@
       </w:r>
       <w:r>
         <w:t xml:space="preserve">from the saved run file.</w:t>
+      </w:r>
+    </w:p>
+    <w:p>
+      <w:pPr>
+        <w:numPr>
+          <w:ilvl w:val="0"/>
+          <w:numId w:val="1004"/>
+        </w:numPr>
+        <w:pStyle w:val="Compact"/>
+      </w:pPr>
+      <w:r>
+        <w:rPr>
+          <w:bCs/>
+          <w:b/>
+        </w:rPr>
+        <w:t xml:space="preserve">The value scorer could not score q10–q12.</w:t>
+      </w:r>
+      <w:r>
+        <w:t xml:space="preserve"> </w:t>
+      </w:r>
+      <w:r>
+        <w:t xml:space="preserve">It extracted every digit-run from the ground truth and required each in the answer, so the three textual questions scored 0/3 in every run regardless of the answer, and the series’ headline</w:t>
+      </w:r>
+      <w:r>
+        <w:t xml:space="preserve"> </w:t>
+      </w:r>
+      <w:r>
+        <w:t xml:space="preserve">“</w:t>
+      </w:r>
+      <w:r>
+        <w:t xml:space="preserve">27/36</w:t>
+      </w:r>
+      <w:r>
+        <w:t xml:space="preserve">”</w:t>
+      </w:r>
+      <w:r>
+        <w:t xml:space="preserve"> </w:t>
+      </w:r>
+      <w:r>
+        <w:t xml:space="preserve">in earlier drafts and files was 27/27 on nine questions plus 0/9 unscoreable. Curated key tokens per question were added on 2026-09-29; earlier value figures on those three questions are withdrawn, not corrected. Fidelity grades, which are model-graded against the contract, are unaffected.</w:t>
       </w:r>
     </w:p>
     <w:bookmarkEnd w:id="48"/>
@@ -2449,7 +2577,7 @@
               <w:jc w:val="left"/>
             </w:pPr>
             <w:r>
-              <w:t xml:space="preserve">value</w:t>
+              <w:t xml:space="preserve">value†</w:t>
             </w:r>
           </w:p>
         </w:tc>
@@ -2523,7 +2651,7 @@
               <w:jc w:val="left"/>
             </w:pPr>
             <w:r>
-              <w:t xml:space="preserve">27/36</w:t>
+              <w:t xml:space="preserve">27/27</w:t>
             </w:r>
           </w:p>
         </w:tc>
@@ -2597,7 +2725,7 @@
               <w:jc w:val="left"/>
             </w:pPr>
             <w:r>
-              <w:t xml:space="preserve">27/36</w:t>
+              <w:t xml:space="preserve">27/27</w:t>
             </w:r>
           </w:p>
         </w:tc>
@@ -2671,7 +2799,7 @@
               <w:jc w:val="left"/>
             </w:pPr>
             <w:r>
-              <w:t xml:space="preserve">27/36</w:t>
+              <w:t xml:space="preserve">27/27</w:t>
             </w:r>
           </w:p>
         </w:tc>
@@ -2745,7 +2873,7 @@
               <w:jc w:val="left"/>
             </w:pPr>
             <w:r>
-              <w:t xml:space="preserve">27/36</w:t>
+              <w:t xml:space="preserve">27/27</w:t>
             </w:r>
           </w:p>
         </w:tc>
@@ -2819,7 +2947,7 @@
               <w:jc w:val="left"/>
             </w:pPr>
             <w:r>
-              <w:t xml:space="preserve">27/36</w:t>
+              <w:t xml:space="preserve">27/27</w:t>
             </w:r>
           </w:p>
         </w:tc>
@@ -2893,7 +3021,7 @@
               <w:jc w:val="left"/>
             </w:pPr>
             <w:r>
-              <w:t xml:space="preserve">27/36</w:t>
+              <w:t xml:space="preserve">27/27</w:t>
             </w:r>
           </w:p>
         </w:tc>
@@ -2935,6 +3063,14 @@
         </w:tc>
       </w:tr>
     </w:tbl>
+    <w:p>
+      <w:pPr>
+        <w:pStyle w:val="BodyText"/>
+      </w:pPr>
+      <w:r>
+        <w:t xml:space="preserve">† Value is reported over the nine numeric questions; q10–q12 were unscoreable by the value scorer in every run listed (limitation 8).</w:t>
+      </w:r>
+    </w:p>
     <w:p>
       <w:pPr>
         <w:pStyle w:val="BodyText"/>

</xml_diff>